<commit_message>
Amplia el informe de la 5.1 a dos paginas
El resumen de la tarea en el campus pide un informe de 2 a 3 paginas en
APA; el documento de instrucciones pedia una. Se agregan los resultados
de cada pieza, el flujo completo entre el asistente y el servidor, y los
dos defectos que encontro la verificacion. La tabla de permisos y la
comparacion con importar pca_utils.py no cambian.

Co-Authored-By: Claude Opus 5.5 <noreply@anthropic.com>
Claude-Session: https://claude.ai/code/session_01EmNfr5WQiRzuLJQpd5cxk6
</commit_message>
<xml_diff>
--- a/MAI540_Tarea5.1_Informe_Araceli_Castillo.docx
+++ b/MAI540_Tarea5.1_Informe_Araceli_Castillo.docx
@@ -163,6 +163,20 @@
     </w:p>
     <w:p>
       <w:pPr>
+        <w:spacing w:after="0" w:before="0" w:line="480" w:lineRule="auto"/>
+        <w:ind w:firstLine="720"/>
+      </w:pPr>
+      <w:r>
+        <w:rPr>
+          <w:rFonts w:ascii="Times New Roman" w:cs="Times New Roman" w:eastAsia="Times New Roman" w:hAnsi="Times New Roman"/>
+          <w:sz w:val="24"/>
+          <w:szCs w:val="24"/>
+        </w:rPr>
+        <w:t xml:space="preserve">En clase se completó mcp_server.py, un servidor del Protocolo de Contexto de Modelos (MCP) que expone análisis de componentes principales (PCA) sobre los archivos de la carpeta datasets/. Este informe documenta cómo se verificó cada pieza, el flujo completo entre el asistente y el servidor, los permisos que concede y qué aporta el protocolo frente a llamar las funciones directamente.</w:t>
+      </w:r>
+    </w:p>
+    <w:p>
+      <w:pPr>
         <w:keepNext/>
         <w:spacing w:line="480" w:lineRule="auto"/>
       </w:pPr>
@@ -174,7 +188,7 @@
           <w:sz w:val="24"/>
           <w:szCs w:val="24"/>
         </w:rPr>
-        <w:t xml:space="preserve">Verificación</w:t>
+        <w:t xml:space="preserve">Verificación de las Cinco Piezas</w:t>
       </w:r>
     </w:p>
     <w:p>
@@ -188,7 +202,67 @@
           <w:sz w:val="24"/>
           <w:szCs w:val="24"/>
         </w:rPr>
-        <w:t xml:space="preserve">Se completaron las cinco piezas de mcp_server.py, una por commit, y cada una se probó en el MCP Inspector antes de pasar a la siguiente; todas respondieron como se esperaba (p. ej., el PCA de scikit-learn [Pedregosa et al., 2011] sobre iris con dos componentes explica el 95.8 % de la varianza). La verificación encontró dos defectos, corregidos en commits aparte: las tools aceptaban un nombre con "../" y leían cualquier CSV del disco, y sus errores llegaban al cliente sin el motivo.</w:t>
+        <w:t xml:space="preserve">Cada pieza se completó en su propio commit y se probó en el MCP Inspector antes de pasar a la siguiente. La tool cargar_dataset con iris devolvió 150 filas, cuatro columnas numéricas y una categórica. La tool ejecutar_pca con iris y dos componentes devolvió una varianza de 72.96 % y 22.85 %, en total 95.81 %, con las cargas de cada variable, calculadas con scikit-learn (Pedregosa et al., 2011). El resource data://datasets devolvió la lista ["iris", "wine"], y el resource con plantilla data://datasets/wine devolvió 178 filas y 13 columnas numéricas. El prompt interpretar_componentes devolvió un mensaje con los tres pasos de interpretación y la pregunta final sobre la varianza acumulada. Las mismas pruebas se repitieron por protocolo con un cliente propio, y la prueba final se hizo en mi computadora desde una terminal nueva.</w:t>
+      </w:r>
+    </w:p>
+    <w:p>
+      <w:pPr>
+        <w:keepNext/>
+        <w:spacing w:line="480" w:lineRule="auto"/>
+      </w:pPr>
+      <w:r>
+        <w:rPr>
+          <w:rFonts w:ascii="Times New Roman" w:cs="Times New Roman" w:eastAsia="Times New Roman" w:hAnsi="Times New Roman"/>
+          <w:b/>
+          <w:bCs/>
+          <w:sz w:val="24"/>
+          <w:szCs w:val="24"/>
+        </w:rPr>
+        <w:t xml:space="preserve">Flujo de la Integración</w:t>
+      </w:r>
+    </w:p>
+    <w:p>
+      <w:pPr>
+        <w:spacing w:after="0" w:before="0" w:line="480" w:lineRule="auto"/>
+        <w:ind w:firstLine="720"/>
+      </w:pPr>
+      <w:r>
+        <w:rPr>
+          <w:rFonts w:ascii="Times New Roman" w:cs="Times New Roman" w:eastAsia="Times New Roman" w:hAnsi="Times New Roman"/>
+          <w:sz w:val="24"/>
+          <w:szCs w:val="24"/>
+        </w:rPr>
+        <w:t xml:space="preserve">Al conectarse, el cliente (el Inspector, Claude Desktop o el CLI del proyecto) pide la lista de tools, resources y prompts. Los resources los lee el cliente directamente: con data://datasets sabe qué archivos hay, sin que el modelo decida nada. Las tools las decide el asistente a partir de su descripción. Primero llama a cargar_dataset para conocer las columnas numéricas y cuántos componentes puede pedir, y después a ejecutar_pca con el número de componentes. La herramienta externa devuelve un JSON con la varianza por componente, la varianza acumulada y las cargas, nunca las filas. Ese resultado se incorpora al proyecto mediante el prompt interpretar_componentes, que pide identificar las variables con mayor carga, explicar el patrón que representan y decidir si los componentes alcanzan.</w:t>
+      </w:r>
+    </w:p>
+    <w:p>
+      <w:pPr>
+        <w:keepNext/>
+        <w:spacing w:line="480" w:lineRule="auto"/>
+      </w:pPr>
+      <w:r>
+        <w:rPr>
+          <w:rFonts w:ascii="Times New Roman" w:cs="Times New Roman" w:eastAsia="Times New Roman" w:hAnsi="Times New Roman"/>
+          <w:b/>
+          <w:bCs/>
+          <w:sz w:val="24"/>
+          <w:szCs w:val="24"/>
+        </w:rPr>
+        <w:t xml:space="preserve">Lo que Encontró la Verificación</w:t>
+      </w:r>
+    </w:p>
+    <w:p>
+      <w:pPr>
+        <w:spacing w:after="0" w:before="0" w:line="480" w:lineRule="auto"/>
+        <w:ind w:firstLine="720"/>
+      </w:pPr>
+      <w:r>
+        <w:rPr>
+          <w:rFonts w:ascii="Times New Roman" w:cs="Times New Roman" w:eastAsia="Times New Roman" w:hAnsi="Times New Roman"/>
+          <w:sz w:val="24"/>
+          <w:szCs w:val="24"/>
+        </w:rPr>
+        <w:t xml:space="preserve">Probar las piezas una por una reveló dos defectos, corregidos en commits aparte y documentados con capturas de antes y después. Primero, las dos tools aceptaban un nombre con "../" y leían cualquier archivo CSV del disco al que llegara el proceso; el resource con plantilla no tenía el problema porque el SDK rechaza esa dirección. Ahora los nombres pasan por una lista de permitidos que solo acepta los archivos de datasets/. Segundo, cuando una tool fallaba, el cliente solo veía «Error executing tool», sin el motivo, y el asistente no podía corregir su siguiente llamada. Ahora el error explica qué datasets existen o en qué rango debe estar el número de componentes.</w:t>
       </w:r>
     </w:p>
     <w:p>
@@ -597,6 +671,11 @@
     </w:tbl>
     <w:p>
       <w:pPr>
+        <w:spacing w:after="0" w:line="240"/>
+      </w:pPr>
+    </w:p>
+    <w:p>
+      <w:pPr>
         <w:keepNext/>
         <w:spacing w:line="480" w:lineRule="auto"/>
       </w:pPr>

</xml_diff>